<commit_message>
added one last thing to user feedbacK
</commit_message>
<xml_diff>
--- a/Documentation/Weekly Report/week7/CMSC-4920-Week7-UserFeedback.docx
+++ b/Documentation/Weekly Report/week7/CMSC-4920-Week7-UserFeedback.docx
@@ -61,13 +61,8 @@
           <w:numId w:val="1"/>
         </w:numPr>
       </w:pPr>
-      <w:proofErr w:type="gramStart"/>
-      <w:r>
-        <w:t>User</w:t>
-      </w:r>
-      <w:proofErr w:type="gramEnd"/>
-      <w:r>
-        <w:t xml:space="preserve"> requested the addition of a profile section, potentially to change usernames</w:t>
+      <w:r>
+        <w:t>User requested the addition of a profile section, potentially to change usernames</w:t>
       </w:r>
     </w:p>
     <w:p>
@@ -116,6 +111,18 @@
       </w:r>
       <w:r>
         <w:t xml:space="preserve"> whether by day or by month.</w:t>
+      </w:r>
+    </w:p>
+    <w:p>
+      <w:pPr>
+        <w:pStyle w:val="ListParagraph"/>
+        <w:numPr>
+          <w:ilvl w:val="1"/>
+          <w:numId w:val="1"/>
+        </w:numPr>
+      </w:pPr>
+      <w:r>
+        <w:t>User suggested a confirm password feature when creating a new account</w:t>
       </w:r>
     </w:p>
     <w:p>

</xml_diff>